<commit_message>
8 lit reviews and paper pdfs
</commit_message>
<xml_diff>
--- a/papers/literature_survey.docx
+++ b/papers/literature_survey.docx
@@ -130,6 +130,1182 @@
           <w:ilvl w:val="0"/>
           <w:numId w:val="3"/>
         </w:numPr>
+        <w:ind w:left="720"/>
+        <w:rPr>
+          <w:lang w:eastAsia="en-AU"/>
+        </w:rPr>
+      </w:pPr>
+      <w:r>
+        <w:rPr>
+          <w:b/>
+          <w:bCs/>
+        </w:rPr>
+        <w:t>“</w:t>
+      </w:r>
+      <w:r>
+        <w:rPr>
+          <w:b/>
+          <w:bCs/>
+        </w:rPr>
+        <w:t>Show</w:t>
+      </w:r>
+      <w:r>
+        <w:rPr>
+          <w:b/>
+          <w:bCs/>
+        </w:rPr>
+        <w:t xml:space="preserve"> </w:t>
+      </w:r>
+      <w:r>
+        <w:rPr>
+          <w:b/>
+          <w:bCs/>
+        </w:rPr>
+        <w:t>and</w:t>
+      </w:r>
+      <w:r>
+        <w:rPr>
+          <w:b/>
+          <w:bCs/>
+        </w:rPr>
+        <w:t xml:space="preserve"> </w:t>
+      </w:r>
+      <w:r>
+        <w:rPr>
+          <w:b/>
+          <w:bCs/>
+        </w:rPr>
+        <w:t>Tell:</w:t>
+      </w:r>
+      <w:r>
+        <w:rPr>
+          <w:b/>
+          <w:bCs/>
+        </w:rPr>
+        <w:t xml:space="preserve"> </w:t>
+      </w:r>
+      <w:r>
+        <w:rPr>
+          <w:b/>
+          <w:bCs/>
+        </w:rPr>
+        <w:t>A</w:t>
+      </w:r>
+      <w:r>
+        <w:rPr>
+          <w:b/>
+          <w:bCs/>
+        </w:rPr>
+        <w:t xml:space="preserve"> </w:t>
+      </w:r>
+      <w:r>
+        <w:rPr>
+          <w:b/>
+          <w:bCs/>
+        </w:rPr>
+        <w:t>Neural</w:t>
+      </w:r>
+      <w:r>
+        <w:rPr>
+          <w:b/>
+          <w:bCs/>
+        </w:rPr>
+        <w:t xml:space="preserve"> </w:t>
+      </w:r>
+      <w:r>
+        <w:rPr>
+          <w:b/>
+          <w:bCs/>
+        </w:rPr>
+        <w:t>Image</w:t>
+      </w:r>
+      <w:r>
+        <w:rPr>
+          <w:b/>
+          <w:bCs/>
+        </w:rPr>
+        <w:t xml:space="preserve"> </w:t>
+      </w:r>
+      <w:r>
+        <w:rPr>
+          <w:b/>
+          <w:bCs/>
+        </w:rPr>
+        <w:t>Caption</w:t>
+      </w:r>
+      <w:r>
+        <w:rPr>
+          <w:b/>
+          <w:bCs/>
+        </w:rPr>
+        <w:t xml:space="preserve"> </w:t>
+      </w:r>
+      <w:r>
+        <w:rPr>
+          <w:b/>
+          <w:bCs/>
+        </w:rPr>
+        <w:t>Generator</w:t>
+      </w:r>
+      <w:r>
+        <w:rPr>
+          <w:b/>
+          <w:bCs/>
+        </w:rPr>
+        <w:t xml:space="preserve">” </w:t>
+      </w:r>
+    </w:p>
+    <w:p>
+      <w:pPr>
+        <w:pStyle w:val="ListParagraph"/>
+        <w:rPr>
+          <w:lang w:eastAsia="en-AU"/>
+        </w:rPr>
+      </w:pPr>
+      <w:proofErr w:type="spellStart"/>
+      <w:r>
+        <w:rPr>
+          <w:lang w:eastAsia="en-AU"/>
+        </w:rPr>
+        <w:t>Vinyals</w:t>
+      </w:r>
+      <w:proofErr w:type="spellEnd"/>
+      <w:r>
+        <w:rPr>
+          <w:lang w:eastAsia="en-AU"/>
+        </w:rPr>
+        <w:t xml:space="preserve"> et al. (2015) introduced </w:t>
+      </w:r>
+      <w:r>
+        <w:rPr>
+          <w:i/>
+          <w:iCs/>
+          <w:lang w:eastAsia="en-AU"/>
+        </w:rPr>
+        <w:t>Show and Tell</w:t>
+      </w:r>
+      <w:r>
+        <w:rPr>
+          <w:lang w:eastAsia="en-AU"/>
+        </w:rPr>
+        <w:t xml:space="preserve">, one of the first successful end-to-end neural image captioning systems based on a CNN-LSTM encoder-decoder architecture. </w:t>
+      </w:r>
+      <w:r>
+        <w:rPr>
+          <w:lang w:eastAsia="en-AU"/>
+        </w:rPr>
+        <w:lastRenderedPageBreak/>
+        <w:t xml:space="preserve">The proposed Neural Image Caption Generator (NIC) uses a Convolutional Neural Network (CNN) to extract image features and a Long Short-Term Memory (LSTM) network to generate natural language descriptions word-by-word. The model was inspired by sequence-to-sequence learning in machine translation, where the image acts as the encoded input and the LSTM decodes it into a sentence. Unlike earlier rule-based or template-driven approaches, NIC was trained end-to-end using maximum likelihood estimation, allowing the system to directly learn the relationship between images and text from data. The paper also introduced the use of beam search decoding to improve sentence generation quality compared to greedy decoding. </w:t>
+      </w:r>
+    </w:p>
+    <w:p>
+      <w:pPr>
+        <w:ind w:left="720"/>
+        <w:rPr>
+          <w:lang w:eastAsia="en-AU"/>
+        </w:rPr>
+      </w:pPr>
+      <w:r>
+        <w:rPr>
+          <w:lang w:eastAsia="en-AU"/>
+        </w:rPr>
+        <w:t xml:space="preserve">The model achieved state-of-the-art performance across several benchmark datasets, including Pascal VOC, Flickr30k, Flickr8k, and MSCOCO. On the MSCOCO development set, NIC achieved a BLEU-4 score of 27.7, METEOR of 23.7, and </w:t>
+      </w:r>
+      <w:proofErr w:type="spellStart"/>
+      <w:r>
+        <w:rPr>
+          <w:lang w:eastAsia="en-AU"/>
+        </w:rPr>
+        <w:t>CIDEr</w:t>
+      </w:r>
+      <w:proofErr w:type="spellEnd"/>
+      <w:r>
+        <w:rPr>
+          <w:lang w:eastAsia="en-AU"/>
+        </w:rPr>
+        <w:t xml:space="preserve"> of 85.5, outperforming previous approaches and approaching human-level </w:t>
+      </w:r>
+      <w:proofErr w:type="spellStart"/>
+      <w:r>
+        <w:rPr>
+          <w:lang w:eastAsia="en-AU"/>
+        </w:rPr>
+        <w:t>CIDEr</w:t>
+      </w:r>
+      <w:proofErr w:type="spellEnd"/>
+      <w:r>
+        <w:rPr>
+          <w:lang w:eastAsia="en-AU"/>
+        </w:rPr>
+        <w:t xml:space="preserve"> performance. On BLEU-1 evaluation, the model improved results from previous state-of-the-art scores of 25 to 59 on Pascal VOC, 56 to 66 on Flickr30k, and 19 to 28 on the SBU dataset. Despite these strong results, the authors noted that metrics such as BLEU do not always correlate well with human judgement, highlighting an important limitation that remains relevant in modern radiology report generation research</w:t>
+      </w:r>
+      <w:r>
+        <w:rPr>
+          <w:lang w:eastAsia="en-AU"/>
+        </w:rPr>
+        <w:t>.</w:t>
+      </w:r>
+    </w:p>
+    <w:p>
+      <w:pPr>
+        <w:rPr>
+          <w:b/>
+          <w:bCs/>
+          <w:lang w:eastAsia="en-AU"/>
+        </w:rPr>
+      </w:pPr>
+    </w:p>
+    <w:p>
+      <w:pPr>
+        <w:pStyle w:val="ListParagraph"/>
+        <w:numPr>
+          <w:ilvl w:val="0"/>
+          <w:numId w:val="3"/>
+        </w:numPr>
+        <w:ind w:left="720"/>
+        <w:rPr>
+          <w:lang w:eastAsia="en-AU"/>
+        </w:rPr>
+      </w:pPr>
+      <w:r>
+        <w:rPr>
+          <w:b/>
+          <w:bCs/>
+          <w:lang w:eastAsia="en-AU"/>
+        </w:rPr>
+        <w:t>“</w:t>
+      </w:r>
+      <w:r>
+        <w:rPr>
+          <w:b/>
+          <w:bCs/>
+          <w:lang w:eastAsia="en-AU"/>
+        </w:rPr>
+        <w:t>Reinforced Cross-modal Alignment for Radiology Report Generation</w:t>
+      </w:r>
+      <w:r>
+        <w:rPr>
+          <w:b/>
+          <w:bCs/>
+          <w:lang w:eastAsia="en-AU"/>
+        </w:rPr>
+        <w:t>”</w:t>
+      </w:r>
+    </w:p>
+    <w:p>
+      <w:pPr>
+        <w:pStyle w:val="ListParagraph"/>
+        <w:rPr>
+          <w:lang w:eastAsia="en-AU"/>
+        </w:rPr>
+      </w:pPr>
+      <w:r>
+        <w:rPr>
+          <w:lang w:eastAsia="en-AU"/>
+        </w:rPr>
+        <w:t xml:space="preserve">Qin and Song (2022) proposed a reinforcement learning based radiology report generation framework called Reinforced Cross-modal Alignment (CMM+RL), designed to improve the alignment between chest X-ray images and generated clinical reports. The model combines a Transformer encoder-decoder architecture with a Cross-modal Memory (CMM) module that stores shared representations between visual and textual features. Reinforcement learning (RL) is then applied using NLG metrics such as BLEU, METEOR, and ROUGE as reward signals to strengthen image-text alignment without requiring explicit annotation of correspondences. The authors argue that previous co-attention approaches lacked accurate supervision for alignment learning, leading to weak grounding between radiographs and generated reports. Their approach was evaluated on the IU X-Ray and MIMIC-CXR datasets using both standard NLG metrics and clinical efficacy metrics such as </w:t>
+      </w:r>
+      <w:proofErr w:type="spellStart"/>
+      <w:r>
+        <w:rPr>
+          <w:lang w:eastAsia="en-AU"/>
+        </w:rPr>
+        <w:t>CheXpert</w:t>
+      </w:r>
+      <w:proofErr w:type="spellEnd"/>
+      <w:r>
+        <w:rPr>
+          <w:lang w:eastAsia="en-AU"/>
+        </w:rPr>
+        <w:t xml:space="preserve"> F1. </w:t>
+      </w:r>
+    </w:p>
+    <w:p>
+      <w:pPr>
+        <w:ind w:left="720"/>
+        <w:rPr>
+          <w:lang w:eastAsia="en-AU"/>
+        </w:rPr>
+      </w:pPr>
+      <w:r>
+        <w:rPr>
+          <w:lang w:eastAsia="en-AU"/>
+        </w:rPr>
+        <w:t xml:space="preserve">The proposed model achieved state-of-the-art performance on both datasets. On IU X-Ray, the model obtained a BLEU-4 score of 0.181, METEOR of 0.201, and ROUGE-L of 0.384, outperforming prior methods such as R2Gen and CMAS-RL. On MIMIC-CXR, the model achieved BLEU-4 of 0.109, METEOR of 0.151, ROUGE-L of 0.287, and a </w:t>
+      </w:r>
+      <w:proofErr w:type="spellStart"/>
+      <w:r>
+        <w:rPr>
+          <w:lang w:eastAsia="en-AU"/>
+        </w:rPr>
+        <w:t>CheXpert</w:t>
+      </w:r>
+      <w:proofErr w:type="spellEnd"/>
+      <w:r>
+        <w:rPr>
+          <w:lang w:eastAsia="en-AU"/>
+        </w:rPr>
+        <w:t xml:space="preserve"> F1 score of 0.292. Human evaluation further showed improvements in correctness, fluency, and content coverage compared to baseline Transformer models. The paper also provided attention-based visualisations demonstrating stronger image-text grounding, where clinically relevant regions such as pleural effusion and enlarged heart size were more accurately aligned with generated report tokens.</w:t>
+      </w:r>
+    </w:p>
+    <w:p>
+      <w:pPr>
+        <w:ind w:left="720"/>
+        <w:rPr>
+          <w:lang w:eastAsia="en-AU"/>
+        </w:rPr>
+      </w:pPr>
+    </w:p>
+    <w:p>
+      <w:pPr>
+        <w:ind w:left="720"/>
+        <w:rPr>
+          <w:lang w:eastAsia="en-AU"/>
+        </w:rPr>
+      </w:pPr>
+    </w:p>
+    <w:p>
+      <w:pPr>
+        <w:ind w:left="720"/>
+        <w:rPr>
+          <w:lang w:eastAsia="en-AU"/>
+        </w:rPr>
+      </w:pPr>
+    </w:p>
+    <w:p>
+      <w:pPr>
+        <w:pStyle w:val="ListParagraph"/>
+        <w:numPr>
+          <w:ilvl w:val="0"/>
+          <w:numId w:val="3"/>
+        </w:numPr>
+        <w:ind w:left="720"/>
+        <w:rPr>
+          <w:lang w:eastAsia="en-AU"/>
+        </w:rPr>
+      </w:pPr>
+      <w:r>
+        <w:rPr>
+          <w:b/>
+          <w:bCs/>
+          <w:lang w:eastAsia="en-AU"/>
+        </w:rPr>
+        <w:lastRenderedPageBreak/>
+        <w:t>“</w:t>
+      </w:r>
+      <w:r>
+        <w:rPr>
+          <w:b/>
+          <w:bCs/>
+          <w:lang w:eastAsia="en-AU"/>
+        </w:rPr>
+        <w:t>Generating Radiology Reports via Memory-driven Transformer</w:t>
+      </w:r>
+      <w:r>
+        <w:rPr>
+          <w:b/>
+          <w:bCs/>
+          <w:lang w:eastAsia="en-AU"/>
+        </w:rPr>
+        <w:t>”</w:t>
+      </w:r>
+    </w:p>
+    <w:p>
+      <w:pPr>
+        <w:pStyle w:val="ListParagraph"/>
+        <w:rPr>
+          <w:lang w:eastAsia="en-AU"/>
+        </w:rPr>
+      </w:pPr>
+      <w:r>
+        <w:rPr>
+          <w:lang w:eastAsia="en-AU"/>
+        </w:rPr>
+        <w:t xml:space="preserve">Chen et al. (2020) introduced R2Gen, a Memory-driven Transformer framework for automated radiology report generation. The paper addressed one of the key limitations of earlier CNN-RNN image captioning approaches: the inability to generate long, clinically meaningful reports with consistent medical terminology. To solve this, the authors proposed a Relational Memory (RM) module that stores information from previous decoding steps and a Memory-driven Conditional Layer Normalization (MCLN) mechanism that integrates this memory directly into the Transformer decoder. The goal was to help the model learn common reporting patterns found in radiology reports, such as recurring findings and impression structures, while improving long-range dependency modelling. The framework used a ResNet101 visual encoder with a Transformer encoder-decoder backbone and was evaluated on both IU X-Ray and MIMIC-CXR datasets using standard NLG metrics and clinical efficacy metrics based on </w:t>
+      </w:r>
+      <w:proofErr w:type="spellStart"/>
+      <w:r>
+        <w:rPr>
+          <w:lang w:eastAsia="en-AU"/>
+        </w:rPr>
+        <w:t>CheXpert</w:t>
+      </w:r>
+      <w:proofErr w:type="spellEnd"/>
+      <w:r>
+        <w:rPr>
+          <w:lang w:eastAsia="en-AU"/>
+        </w:rPr>
+        <w:t xml:space="preserve"> labels. </w:t>
+      </w:r>
+    </w:p>
+    <w:p>
+      <w:pPr>
+        <w:pStyle w:val="ListParagraph"/>
+        <w:rPr>
+          <w:lang w:eastAsia="en-AU"/>
+        </w:rPr>
+      </w:pPr>
+    </w:p>
+    <w:p>
+      <w:pPr>
+        <w:pStyle w:val="ListParagraph"/>
+        <w:rPr>
+          <w:lang w:eastAsia="en-AU"/>
+        </w:rPr>
+      </w:pPr>
+      <w:r>
+        <w:rPr>
+          <w:lang w:eastAsia="en-AU"/>
+        </w:rPr>
+        <w:t xml:space="preserve">The proposed model achieved state-of-the-art performance at the time on both datasets. On IU X-Ray, the full RM+MCLN model achieved a BLEU-4 score of 0.165, METEOR of 0.187, and ROUGE-L of 0.371. On MIMIC-CXR, it achieved BLEU-4 of 0.103, METEOR of 0.142, ROUGE-L of 0.277, and a </w:t>
+      </w:r>
+      <w:proofErr w:type="spellStart"/>
+      <w:r>
+        <w:rPr>
+          <w:lang w:eastAsia="en-AU"/>
+        </w:rPr>
+        <w:t>CheXpert</w:t>
+      </w:r>
+      <w:proofErr w:type="spellEnd"/>
+      <w:r>
+        <w:rPr>
+          <w:lang w:eastAsia="en-AU"/>
+        </w:rPr>
+        <w:t xml:space="preserve"> F1 score of 0.276. The authors also showed that memory-based decoding generated longer and more detailed reports compared to vanilla Transformers, with report length distributions closer to the ground truth. Qualitative analysis further demonstrated stronger image-text attention alignment, where the model better localized clinically relevant regions such as cardiomegaly, pleural effusion, and atelectasis. However, the paper also identified a major limitation: severe class imbalance in radiology datasets caused the model to over-predict common “normal” findings while underperforming on rare abnormalities.</w:t>
+      </w:r>
+    </w:p>
+    <w:p>
+      <w:pPr>
+        <w:rPr>
+          <w:lang w:eastAsia="en-AU"/>
+        </w:rPr>
+      </w:pPr>
+    </w:p>
+    <w:p>
+      <w:pPr>
+        <w:pStyle w:val="ListParagraph"/>
+        <w:numPr>
+          <w:ilvl w:val="0"/>
+          <w:numId w:val="3"/>
+        </w:numPr>
+        <w:ind w:left="720"/>
+        <w:rPr>
+          <w:lang w:eastAsia="en-AU"/>
+        </w:rPr>
+      </w:pPr>
+      <w:r>
+        <w:rPr>
+          <w:b/>
+          <w:bCs/>
+          <w:lang w:eastAsia="en-AU"/>
+        </w:rPr>
+        <w:t>“</w:t>
+      </w:r>
+      <w:r>
+        <w:rPr>
+          <w:b/>
+          <w:bCs/>
+          <w:lang w:eastAsia="en-AU"/>
+        </w:rPr>
+        <w:t>On the Automatic Generation of Medical Imaging Reports</w:t>
+      </w:r>
+      <w:r>
+        <w:rPr>
+          <w:b/>
+          <w:bCs/>
+          <w:lang w:eastAsia="en-AU"/>
+        </w:rPr>
+        <w:t>”</w:t>
+      </w:r>
+    </w:p>
+    <w:p>
+      <w:pPr>
+        <w:pStyle w:val="ListParagraph"/>
+        <w:rPr>
+          <w:lang w:eastAsia="en-AU"/>
+        </w:rPr>
+      </w:pPr>
+      <w:r>
+        <w:rPr>
+          <w:lang w:eastAsia="en-AU"/>
+        </w:rPr>
+        <w:t xml:space="preserve">Jing et al. (2018) proposed one of the earliest deep learning frameworks specifically designed for automatic medical imaging report generation. Unlike traditional image captioning models that generate short single-sentence captions, the paper addressed the challenge of producing long and clinically meaningful radiology reports. The authors introduced a multi-task learning framework that jointly predicts medical tags and generates paragraph-level reports from chest X-ray images. Their architecture combined a CNN visual encoder, a co-attention mechanism, and a hierarchical LSTM decoder. The co-attention module simultaneously attended to visual image regions and semantic tag embeddings, helping the model localize abnormal areas while generating corresponding clinical descriptions. In addition, the hierarchical LSTM generated reports sentence-by-sentence using topic vectors, allowing the system to better model long-range dependencies and multi-sentence report structures. </w:t>
+      </w:r>
+    </w:p>
+    <w:p>
+      <w:pPr>
+        <w:pStyle w:val="ListParagraph"/>
+        <w:rPr>
+          <w:lang w:eastAsia="en-AU"/>
+        </w:rPr>
+      </w:pPr>
+    </w:p>
+    <w:p>
+      <w:pPr>
+        <w:pStyle w:val="ListParagraph"/>
+        <w:rPr>
+          <w:lang w:eastAsia="en-AU"/>
+        </w:rPr>
+      </w:pPr>
+      <w:r>
+        <w:rPr>
+          <w:lang w:eastAsia="en-AU"/>
+        </w:rPr>
+        <w:t xml:space="preserve">The model was evaluated on the IU X-Ray and PEIR Gross datasets using BLEU, METEOR, ROUGE, and </w:t>
+      </w:r>
+      <w:proofErr w:type="spellStart"/>
+      <w:r>
+        <w:rPr>
+          <w:lang w:eastAsia="en-AU"/>
+        </w:rPr>
+        <w:t>CIDEr</w:t>
+      </w:r>
+      <w:proofErr w:type="spellEnd"/>
+      <w:r>
+        <w:rPr>
+          <w:lang w:eastAsia="en-AU"/>
+        </w:rPr>
+        <w:t xml:space="preserve"> metrics. On the IU X-Ray dataset, the proposed </w:t>
+      </w:r>
+      <w:proofErr w:type="spellStart"/>
+      <w:r>
+        <w:rPr>
+          <w:lang w:eastAsia="en-AU"/>
+        </w:rPr>
+        <w:t>CoAttention</w:t>
+      </w:r>
+      <w:proofErr w:type="spellEnd"/>
+      <w:r>
+        <w:rPr>
+          <w:lang w:eastAsia="en-AU"/>
+        </w:rPr>
+        <w:t xml:space="preserve"> model achieved a BLEU-4 score of 0.247, METEOR of 0.217, ROUGE-L of 0.447, and </w:t>
+      </w:r>
+      <w:proofErr w:type="spellStart"/>
+      <w:r>
+        <w:rPr>
+          <w:lang w:eastAsia="en-AU"/>
+        </w:rPr>
+        <w:t>CIDEr</w:t>
+      </w:r>
+      <w:proofErr w:type="spellEnd"/>
+      <w:r>
+        <w:rPr>
+          <w:lang w:eastAsia="en-AU"/>
+        </w:rPr>
+        <w:t xml:space="preserve"> of 0.327, outperforming earlier image captioning baselines such as CNN-RNN and Soft Attention. Qualitative analysis showed that the model generated more clinically relevant abnormality descriptions compared to previous approaches, </w:t>
+      </w:r>
+      <w:r>
+        <w:rPr>
+          <w:lang w:eastAsia="en-AU"/>
+        </w:rPr>
+        <w:lastRenderedPageBreak/>
+        <w:t xml:space="preserve">particularly for findings related to the lungs and heart. The paper also demonstrated that co-attention improved abnormality localization by aligning generated sentences with both image regions and predicted semantic tags. However, the authors noted that the system still struggled with subtle abnormalities and occasionally generated incorrect findings due to limitations in the tag prediction module and sensitivity to image variations. </w:t>
+      </w:r>
+    </w:p>
+    <w:p>
+      <w:pPr>
+        <w:pStyle w:val="ListParagraph"/>
+        <w:rPr>
+          <w:lang w:eastAsia="en-AU"/>
+        </w:rPr>
+      </w:pPr>
+    </w:p>
+    <w:p>
+      <w:pPr>
+        <w:pStyle w:val="ListParagraph"/>
+        <w:numPr>
+          <w:ilvl w:val="0"/>
+          <w:numId w:val="3"/>
+        </w:numPr>
+        <w:rPr>
+          <w:lang w:eastAsia="en-AU"/>
+        </w:rPr>
+      </w:pPr>
+      <w:r>
+        <w:rPr>
+          <w:b/>
+          <w:bCs/>
+          <w:lang w:eastAsia="en-AU"/>
+        </w:rPr>
+        <w:t>“</w:t>
+      </w:r>
+      <w:r>
+        <w:rPr>
+          <w:b/>
+          <w:bCs/>
+          <w:lang w:eastAsia="en-AU"/>
+        </w:rPr>
+        <w:t>Focal Loss for Dense Object Detection</w:t>
+      </w:r>
+      <w:r>
+        <w:rPr>
+          <w:b/>
+          <w:bCs/>
+          <w:lang w:eastAsia="en-AU"/>
+        </w:rPr>
+        <w:t>”</w:t>
+      </w:r>
+    </w:p>
+    <w:p>
+      <w:pPr>
+        <w:pStyle w:val="ListParagraph"/>
+        <w:ind w:left="1080"/>
+        <w:rPr>
+          <w:lang w:eastAsia="en-AU"/>
+        </w:rPr>
+      </w:pPr>
+      <w:r>
+        <w:rPr>
+          <w:lang w:eastAsia="en-AU"/>
+        </w:rPr>
+        <w:t xml:space="preserve">Lin et al. (2018) introduced Focal Loss, a modified loss function designed to address severe class imbalance in dense object detection tasks. Traditional one-stage detectors struggled because training was dominated by a very large number of easy negative examples, causing the model to focus less on difficult or rare cases. To solve this, the authors proposed Focal Loss, which extends standard cross-entropy loss by adding a modulating factor </w:t>
+      </w:r>
+      <m:oMath>
+        <m:d>
+          <m:dPr>
+            <m:sepChr m:val="−"/>
+            <m:endChr m:val=""/>
+            <m:ctrlPr>
+              <w:rPr>
+                <w:rFonts w:ascii="Cambria Math" w:hAnsi="Cambria Math"/>
+                <w:lang w:eastAsia="en-AU"/>
+              </w:rPr>
+            </m:ctrlPr>
+          </m:dPr>
+          <m:e>
+            <m:r>
+              <w:rPr>
+                <w:rFonts w:ascii="Cambria Math" w:hAnsi="Cambria Math"/>
+                <w:lang w:eastAsia="en-AU"/>
+              </w:rPr>
+              <m:t>1</m:t>
+            </m:r>
+          </m:e>
+          <m:e>
+            <m:sSub>
+              <m:sSubPr>
+                <m:ctrlPr>
+                  <w:rPr>
+                    <w:rFonts w:ascii="Cambria Math" w:hAnsi="Cambria Math"/>
+                    <w:lang w:eastAsia="en-AU"/>
+                  </w:rPr>
+                </m:ctrlPr>
+              </m:sSubPr>
+              <m:e>
+                <m:r>
+                  <w:rPr>
+                    <w:rFonts w:ascii="Cambria Math" w:hAnsi="Cambria Math"/>
+                    <w:lang w:eastAsia="en-AU"/>
+                  </w:rPr>
+                  <m:t>p</m:t>
+                </m:r>
+              </m:e>
+              <m:sub>
+                <m:r>
+                  <w:rPr>
+                    <w:rFonts w:ascii="Cambria Math" w:hAnsi="Cambria Math"/>
+                    <w:lang w:eastAsia="en-AU"/>
+                  </w:rPr>
+                  <m:t>t</m:t>
+                </m:r>
+              </m:sub>
+            </m:sSub>
+            <m:sSup>
+              <m:sSupPr>
+                <m:ctrlPr>
+                  <w:rPr>
+                    <w:rFonts w:ascii="Cambria Math" w:hAnsi="Cambria Math"/>
+                    <w:lang w:eastAsia="en-AU"/>
+                  </w:rPr>
+                </m:ctrlPr>
+              </m:sSupPr>
+              <m:e>
+                <m:r>
+                  <w:rPr>
+                    <w:rFonts w:ascii="Cambria Math" w:hAnsi="Cambria Math"/>
+                    <w:lang w:eastAsia="en-AU"/>
+                  </w:rPr>
+                  <m:t>)</m:t>
+                </m:r>
+              </m:e>
+              <m:sup>
+                <m:r>
+                  <w:rPr>
+                    <w:rFonts w:ascii="Cambria Math" w:hAnsi="Cambria Math"/>
+                    <w:lang w:eastAsia="en-AU"/>
+                  </w:rPr>
+                  <m:t>γ</m:t>
+                </m:r>
+              </m:sup>
+            </m:sSup>
+          </m:e>
+        </m:d>
+      </m:oMath>
+      <w:r>
+        <w:rPr>
+          <w:lang w:eastAsia="en-AU"/>
+        </w:rPr>
+        <w:t xml:space="preserve">that reduces the contribution of well-classified examples and forces the model to focus on harder samples. The paper also introduced RetinaNet, a one-stage object detector built using a ResNet-FPN backbone and dense anchor prediction. Unlike earlier detectors that relied heavily on hard negative mining or proposal stages, RetinaNet achieved strong performance primarily because of the new loss formulation rather than architectural complexity. </w:t>
+      </w:r>
+    </w:p>
+    <w:p>
+      <w:pPr>
+        <w:pStyle w:val="ListParagraph"/>
+        <w:ind w:left="1080"/>
+        <w:rPr>
+          <w:lang w:eastAsia="en-AU"/>
+        </w:rPr>
+      </w:pPr>
+    </w:p>
+    <w:p>
+      <w:pPr>
+        <w:pStyle w:val="ListParagraph"/>
+        <w:ind w:left="1080"/>
+        <w:rPr>
+          <w:lang w:eastAsia="en-AU"/>
+        </w:rPr>
+      </w:pPr>
+      <w:r>
+        <w:rPr>
+          <w:lang w:eastAsia="en-AU"/>
+        </w:rPr>
+        <w:t xml:space="preserve">The proposed approach achieved state-of-the-art results on the COCO benchmark while maintaining high inference speed. </w:t>
+      </w:r>
+      <w:proofErr w:type="spellStart"/>
+      <w:r>
+        <w:rPr>
+          <w:lang w:eastAsia="en-AU"/>
+        </w:rPr>
+        <w:t>RetinaNet</w:t>
+      </w:r>
+      <w:proofErr w:type="spellEnd"/>
+      <w:r>
+        <w:rPr>
+          <w:lang w:eastAsia="en-AU"/>
+        </w:rPr>
+        <w:t xml:space="preserve"> with a ResNet-101-FPN backbone achieved 39.1 AP on COCO test-dev, outperforming previous one-stage detectors such as SSD and DSSD, and even surpassing several two-stage detectors like Faster R-CNN with FPN. Ablation studies showed that Focal Loss significantly improved performance compared to standard cross-entropy loss, with the best configuration (</w:t>
+      </w:r>
+      <m:oMath>
+        <m:r>
+          <w:rPr>
+            <w:rFonts w:ascii="Cambria Math" w:hAnsi="Cambria Math"/>
+            <w:lang w:eastAsia="en-AU"/>
+          </w:rPr>
+          <m:t>γ=2</m:t>
+        </m:r>
+      </m:oMath>
+      <w:r>
+        <w:rPr>
+          <w:lang w:eastAsia="en-AU"/>
+        </w:rPr>
+        <w:t xml:space="preserve">, </w:t>
+      </w:r>
+      <m:oMath>
+        <m:r>
+          <w:rPr>
+            <w:rFonts w:ascii="Cambria Math" w:hAnsi="Cambria Math"/>
+            <w:lang w:eastAsia="en-AU"/>
+          </w:rPr>
+          <m:t>α=0.25</m:t>
+        </m:r>
+      </m:oMath>
+      <w:r>
+        <w:rPr>
+          <w:lang w:eastAsia="en-AU"/>
+        </w:rPr>
+        <w:t>) achieving a 2.9 AP improvement. The paper demonstrated that the loss function effectively concentrated learning on difficult examples while suppressing easy negatives, making training more stable under heavy imbalance conditions. Although originally developed for object detection, Focal Loss later became widely adopted in medical imaging and classification tasks where rare abnormalities are underrepresented, making it highly relevant for handling imbalance in radiology report generation and abnormality detection pipelines.</w:t>
+      </w:r>
+    </w:p>
+    <w:p>
+      <w:pPr>
+        <w:pStyle w:val="ListParagraph"/>
+        <w:ind w:left="1080"/>
+        <w:rPr>
+          <w:b/>
+          <w:bCs/>
+          <w:lang w:eastAsia="en-AU"/>
+        </w:rPr>
+      </w:pPr>
+    </w:p>
+    <w:p>
+      <w:pPr>
+        <w:pStyle w:val="ListParagraph"/>
+        <w:numPr>
+          <w:ilvl w:val="0"/>
+          <w:numId w:val="3"/>
+        </w:numPr>
+        <w:rPr>
+          <w:lang w:eastAsia="en-AU"/>
+        </w:rPr>
+      </w:pPr>
+      <w:r>
+        <w:rPr>
+          <w:b/>
+          <w:bCs/>
+          <w:lang w:eastAsia="en-AU"/>
+        </w:rPr>
+        <w:t>“</w:t>
+      </w:r>
+      <w:proofErr w:type="spellStart"/>
+      <w:r>
+        <w:rPr>
+          <w:b/>
+          <w:bCs/>
+          <w:lang w:eastAsia="en-AU"/>
+        </w:rPr>
+        <w:t>CheXNet</w:t>
+      </w:r>
+      <w:proofErr w:type="spellEnd"/>
+      <w:r>
+        <w:rPr>
+          <w:b/>
+          <w:bCs/>
+          <w:lang w:eastAsia="en-AU"/>
+        </w:rPr>
+        <w:t>: Radiologist-Level Pneumonia Detection on Chest X-Rays with Deep Learning</w:t>
+      </w:r>
+      <w:r>
+        <w:rPr>
+          <w:b/>
+          <w:bCs/>
+          <w:lang w:eastAsia="en-AU"/>
+        </w:rPr>
+        <w:t>”</w:t>
+      </w:r>
+    </w:p>
+    <w:p>
+      <w:pPr>
+        <w:pStyle w:val="ListParagraph"/>
+        <w:ind w:left="1080"/>
+        <w:rPr>
+          <w:lang w:eastAsia="en-AU"/>
+        </w:rPr>
+      </w:pPr>
+      <w:proofErr w:type="spellStart"/>
+      <w:r>
+        <w:rPr>
+          <w:lang w:eastAsia="en-AU"/>
+        </w:rPr>
+        <w:t>Rajpurkar</w:t>
+      </w:r>
+      <w:proofErr w:type="spellEnd"/>
+      <w:r>
+        <w:rPr>
+          <w:lang w:eastAsia="en-AU"/>
+        </w:rPr>
+        <w:t xml:space="preserve"> et al. (2017) introduced </w:t>
+      </w:r>
+      <w:proofErr w:type="spellStart"/>
+      <w:r>
+        <w:rPr>
+          <w:lang w:eastAsia="en-AU"/>
+        </w:rPr>
+        <w:t>CheXNet</w:t>
+      </w:r>
+      <w:proofErr w:type="spellEnd"/>
+      <w:r>
+        <w:rPr>
+          <w:lang w:eastAsia="en-AU"/>
+        </w:rPr>
+        <w:t xml:space="preserve">, a 121-layer </w:t>
+      </w:r>
+      <w:proofErr w:type="spellStart"/>
+      <w:r>
+        <w:rPr>
+          <w:lang w:eastAsia="en-AU"/>
+        </w:rPr>
+        <w:t>DenseNet</w:t>
+      </w:r>
+      <w:proofErr w:type="spellEnd"/>
+      <w:r>
+        <w:rPr>
+          <w:lang w:eastAsia="en-AU"/>
+        </w:rPr>
+        <w:t xml:space="preserve">-based deep learning model designed for automated pneumonia detection from chest X-rays. The model was trained on the ChestX-ray14 dataset, which contains over 112,000 frontal chest X-ray images labelled across 14 thoracic diseases. </w:t>
+      </w:r>
+      <w:proofErr w:type="spellStart"/>
+      <w:r>
+        <w:rPr>
+          <w:lang w:eastAsia="en-AU"/>
+        </w:rPr>
+        <w:t>CheXNet</w:t>
+      </w:r>
+      <w:proofErr w:type="spellEnd"/>
+      <w:r>
+        <w:rPr>
+          <w:lang w:eastAsia="en-AU"/>
+        </w:rPr>
+        <w:t xml:space="preserve"> used a DenseNet-121 architecture pretrained on ImageNet and optimized using weighted binary cross-entropy loss to address class imbalance between positive and negative pneumonia cases. Unlike earlier approaches, the model also incorporated Class Activation Maps (CAMs) to provide visual explanations by highlighting image regions most relevant to the prediction. The authors later extended the framework from binary pneumonia detection to full multi-label thoracic disease classification across all 14 pathologies in ChestX-ray14.</w:t>
+      </w:r>
+    </w:p>
+    <w:p>
+      <w:pPr>
+        <w:pStyle w:val="ListParagraph"/>
+        <w:ind w:left="1080"/>
+        <w:rPr>
+          <w:lang w:eastAsia="en-AU"/>
+        </w:rPr>
+      </w:pPr>
+    </w:p>
+    <w:p>
+      <w:pPr>
+        <w:pStyle w:val="ListParagraph"/>
+        <w:ind w:left="1080"/>
+        <w:rPr>
+          <w:lang w:eastAsia="en-AU"/>
+        </w:rPr>
+      </w:pPr>
+      <w:proofErr w:type="spellStart"/>
+      <w:r>
+        <w:rPr>
+          <w:lang w:eastAsia="en-AU"/>
+        </w:rPr>
+        <w:t>CheXNet</w:t>
+      </w:r>
+      <w:proofErr w:type="spellEnd"/>
+      <w:r>
+        <w:rPr>
+          <w:lang w:eastAsia="en-AU"/>
+        </w:rPr>
+        <w:t xml:space="preserve"> achieved radiologist-level performance on pneumonia detection, obtaining an F1 score of 0.435 compared to the average radiologist F1 score of 0.387, with the difference shown to be statistically significant. For multi-disease classification, the model achieved state-of-the-art AUROC results across all 14 thoracic diseases, including 0.7680 for Pneumonia, 0.9248 for Cardiomegaly, and 0.8887 for Pneumothorax. The paper demonstrated that </w:t>
+      </w:r>
+      <w:proofErr w:type="spellStart"/>
+      <w:r>
+        <w:rPr>
+          <w:lang w:eastAsia="en-AU"/>
+        </w:rPr>
+        <w:t>DenseNet</w:t>
+      </w:r>
+      <w:proofErr w:type="spellEnd"/>
+      <w:r>
+        <w:rPr>
+          <w:lang w:eastAsia="en-AU"/>
+        </w:rPr>
+        <w:t xml:space="preserve"> architectures could effectively learn clinically relevant visual features from large-scale chest X-ray datasets while also improving interpretability through localization heatmaps. However, the authors noted several limitations, including reliance on weakly labelled reports, lack of patient history, and the use of only frontal-view radiographs during evaluation.</w:t>
+      </w:r>
+    </w:p>
+    <w:p>
+      <w:pPr>
+        <w:pStyle w:val="ListParagraph"/>
+        <w:ind w:left="1080"/>
+        <w:rPr>
+          <w:lang w:eastAsia="en-AU"/>
+        </w:rPr>
+      </w:pPr>
+    </w:p>
+    <w:p>
+      <w:pPr>
+        <w:pStyle w:val="ListParagraph"/>
+        <w:numPr>
+          <w:ilvl w:val="0"/>
+          <w:numId w:val="3"/>
+        </w:numPr>
+        <w:rPr>
+          <w:b/>
+          <w:bCs/>
+          <w:lang w:eastAsia="en-AU"/>
+        </w:rPr>
+      </w:pPr>
+      <w:r>
+        <w:rPr>
+          <w:b/>
+          <w:bCs/>
+          <w:lang w:eastAsia="en-AU"/>
+        </w:rPr>
+        <w:t>“</w:t>
+      </w:r>
+      <w:r>
+        <w:rPr>
+          <w:b/>
+          <w:bCs/>
+        </w:rPr>
+        <w:t>GIT-CXR: End-to-End Transformer for Chest X-Ray</w:t>
+      </w:r>
+      <w:r>
+        <w:rPr>
+          <w:b/>
+          <w:bCs/>
+        </w:rPr>
+        <w:t xml:space="preserve"> </w:t>
+      </w:r>
+      <w:r>
+        <w:rPr>
+          <w:b/>
+          <w:bCs/>
+        </w:rPr>
+        <w:t>Report Generation</w:t>
+      </w:r>
+      <w:r>
+        <w:rPr>
+          <w:b/>
+          <w:bCs/>
+        </w:rPr>
+        <w:t>”</w:t>
+      </w:r>
+    </w:p>
+    <w:p>
+      <w:pPr>
+        <w:pStyle w:val="ListParagraph"/>
+        <w:ind w:left="1080"/>
+        <w:rPr>
+          <w:lang w:eastAsia="en-AU"/>
+        </w:rPr>
+      </w:pPr>
+      <w:r>
+        <w:rPr>
+          <w:lang w:eastAsia="en-AU"/>
+        </w:rPr>
+        <w:t>Sîrbu et al. (2025) proposed GIT-CXR, an end-to-end transformer framework for automated chest X-ray report generation using the GIT (Generative Image-to-Text Transformer) architecture. Unlike earlier CNN-RNN approaches, the model directly maps radiographs to reports using a pure transformer pipeline combined with multi-view image fusion, contextual patient history, and curriculum learning based on report length. The paper introduced curriculum learning to progressively train the model on increasingly longer and clinically complex reports, addressing the common issue of short and generic report generation. Evaluated on the MIMIC-CXR-JPG dataset, GIT-CXR achieved state-of-the-art performance on METEOR and clinical F1 metrics, reporting BLEU-4 of 0.168, ROUGE-L of 0.312, METEOR of 0.369, and F1-micro of 0.534. The authors showed that curriculum learning significantly improved long-report generation and clinical consistency, although performance still dropped on underrepresented pathologies and rare abnormalities.</w:t>
+      </w:r>
+    </w:p>
+    <w:p>
+      <w:pPr>
+        <w:pStyle w:val="ListParagraph"/>
+        <w:ind w:left="1080"/>
+        <w:rPr>
+          <w:lang w:eastAsia="en-AU"/>
+        </w:rPr>
+      </w:pPr>
+    </w:p>
+    <w:p>
+      <w:pPr>
+        <w:pStyle w:val="ListParagraph"/>
+        <w:numPr>
+          <w:ilvl w:val="0"/>
+          <w:numId w:val="3"/>
+        </w:numPr>
+        <w:rPr>
+          <w:lang w:eastAsia="en-AU"/>
+        </w:rPr>
+      </w:pPr>
+      <w:r>
+        <w:rPr>
+          <w:b/>
+          <w:bCs/>
+          <w:lang w:eastAsia="en-AU"/>
+        </w:rPr>
+        <w:t>“</w:t>
+      </w:r>
+      <w:r>
+        <w:rPr>
+          <w:b/>
+          <w:bCs/>
+          <w:lang w:eastAsia="en-AU"/>
+        </w:rPr>
+        <w:t>Radiology Report Generation via Multi-objective Preference Optimization</w:t>
+      </w:r>
+      <w:r>
+        <w:rPr>
+          <w:b/>
+          <w:bCs/>
+          <w:lang w:eastAsia="en-AU"/>
+        </w:rPr>
+        <w:t>”</w:t>
+      </w:r>
+    </w:p>
+    <w:p>
+      <w:pPr>
+        <w:pStyle w:val="ListParagraph"/>
+        <w:ind w:left="1080"/>
+        <w:rPr>
+          <w:lang w:eastAsia="en-AU"/>
+        </w:rPr>
+      </w:pPr>
+      <w:r>
+        <w:rPr>
+          <w:lang w:eastAsia="en-AU"/>
+        </w:rPr>
+        <w:t xml:space="preserve">Xiao et al. (2024) proposed MPO (Multi-objective Preference Optimization), a reinforcement learning based framework for radiology report generation that aligns generated reports with different radiologist preferences. Unlike earlier RRG approaches that optimize a single reward function, MPO introduces a multi-objective optimization strategy where multiple evaluation metrics are combined using a preference vector. The architecture builds on a Transformer encoder-decoder framework with a Preference Vector Fusion (PVF) module that uses multi-head attention to integrate preference vectors with encoded image features. The model is then optimized using reinforcement learning with weighted rewards derived from both Natural Language Generation (NLG) metrics and Clinical Efficacy (CE) metrics. </w:t>
+      </w:r>
+    </w:p>
+    <w:p>
+      <w:pPr>
+        <w:pStyle w:val="ListParagraph"/>
+        <w:ind w:left="1080"/>
+        <w:rPr>
+          <w:lang w:eastAsia="en-AU"/>
+        </w:rPr>
+      </w:pPr>
+    </w:p>
+    <w:p>
+      <w:pPr>
+        <w:pStyle w:val="ListParagraph"/>
+        <w:ind w:left="1080"/>
+        <w:rPr>
+          <w:lang w:eastAsia="en-AU"/>
+        </w:rPr>
+      </w:pPr>
+      <w:r>
+        <w:rPr>
+          <w:lang w:eastAsia="en-AU"/>
+        </w:rPr>
+        <w:t xml:space="preserve">The model achieved state-of-the-art performance on both IU-Xray and MIMIC-CXR datasets. On IU-Xray, MPO achieved BLEU-4 of 0.209, METEOR of 0.224, and ROUGE-L of 0.415. On MIMIC-CXR, it achieved BLEU-4 of 0.139, METEOR of 0.162, ROUGE-L of 0.309, Precision of 0.436, Recall of 0.376, and F1 score of 0.353, outperforming previous methods such as R2Gen, CMN+RL, and MAN across most metrics. Ablation studies further showed that both the Multi-objective Optimization (MOO) module and PVF attention fusion contributed significantly to performance </w:t>
+      </w:r>
+      <w:r>
+        <w:rPr>
+          <w:lang w:eastAsia="en-AU"/>
+        </w:rPr>
+        <w:lastRenderedPageBreak/>
+        <w:t>improvements. The paper highlighted that preference-guided optimization improves both report quality and clinical consistency while allowing a single model to adapt to different reporting priorities without retraining.</w:t>
+      </w:r>
+    </w:p>
+    <w:p>
+      <w:pPr>
+        <w:pStyle w:val="ListParagraph"/>
+        <w:ind w:left="1080"/>
+        <w:rPr>
+          <w:lang w:eastAsia="en-AU"/>
+        </w:rPr>
+      </w:pPr>
+    </w:p>
+    <w:p>
+      <w:pPr>
+        <w:pStyle w:val="ListParagraph"/>
+        <w:numPr>
+          <w:ilvl w:val="0"/>
+          <w:numId w:val="3"/>
+        </w:numPr>
+        <w:rPr>
+          <w:b/>
+          <w:bCs/>
+          <w:lang w:eastAsia="en-AU"/>
+        </w:rPr>
+      </w:pPr>
+      <w:r>
+        <w:rPr>
+          <w:b/>
+          <w:bCs/>
+          <w:lang w:eastAsia="en-AU"/>
+        </w:rPr>
+        <w:t>“</w:t>
+      </w:r>
+      <w:r>
+        <w:rPr>
+          <w:b/>
+          <w:bCs/>
+          <w:lang w:eastAsia="en-AU"/>
+        </w:rPr>
+        <w:t>Knowledge-Driven Encode, Retrieve, Paraphrase for Medical Image Report Generation</w:t>
+      </w:r>
+      <w:r>
+        <w:rPr>
+          <w:b/>
+          <w:bCs/>
+          <w:lang w:eastAsia="en-AU"/>
+        </w:rPr>
+        <w:t>”</w:t>
+      </w:r>
+    </w:p>
+    <w:p>
+      <w:pPr>
+        <w:pStyle w:val="ListParagraph"/>
+        <w:ind w:left="1080"/>
+        <w:rPr>
+          <w:b/>
+          <w:bCs/>
+          <w:lang w:eastAsia="en-AU"/>
+        </w:rPr>
       </w:pPr>
     </w:p>
     <w:sectPr>
@@ -145,6 +1321,97 @@
 <file path=word/numbering.xml><?xml version="1.0" encoding="utf-8"?>
 <w:numbering xmlns:wpc="http://schemas.microsoft.com/office/word/2010/wordprocessingCanvas" xmlns:cx="http://schemas.microsoft.com/office/drawing/2014/chartex" xmlns:cx1="http://schemas.microsoft.com/office/drawing/2015/9/8/chartex" xmlns:cx2="http://schemas.microsoft.com/office/drawing/2015/10/21/chartex" xmlns:cx3="http://schemas.microsoft.com/office/drawing/2016/5/9/chartex" xmlns:cx4="http://schemas.microsoft.com/office/drawing/2016/5/10/chartex" xmlns:cx5="http://schemas.microsoft.com/office/drawing/2016/5/11/chartex" xmlns:cx6="http://schemas.microsoft.com/office/drawing/2016/5/12/chartex" xmlns:cx7="http://schemas.microsoft.com/office/drawing/2016/5/13/chartex" xmlns:cx8="http://schemas.microsoft.com/office/drawing/2016/5/14/chartex" xmlns:mc="http://schemas.openxmlformats.org/markup-compatibility/2006" xmlns:aink="http://schemas.microsoft.com/office/drawing/2016/ink" xmlns:am3d="http://schemas.microsoft.com/office/drawing/2017/model3d" xmlns:o="urn:schemas-microsoft-com:office:office" xmlns:oel="http://schemas.microsoft.com/office/2019/extlst" xmlns:r="http://schemas.openxmlformats.org/officeDocument/2006/relationships" xmlns:m="http://schemas.openxmlformats.org/officeDocument/2006/math" xmlns:v="urn:schemas-microsoft-com:vml" xmlns:wp14="http://schemas.microsoft.com/office/word/2010/wordprocessingDrawing" xmlns:wp="http://schemas.openxmlformats.org/drawingml/2006/wordprocessingDrawing" xmlns:w10="urn:schemas-microsoft-com:office:word" xmlns:w="http://schemas.openxmlformats.org/wordprocessingml/2006/main" xmlns:w14="http://schemas.microsoft.com/office/word/2010/wordml" xmlns:w15="http://schemas.microsoft.com/office/word/2012/wordml" xmlns:w16cex="http://schemas.microsoft.com/office/word/2018/wordml/cex" xmlns:w16cid="http://schemas.microsoft.com/office/word/2016/wordml/cid" xmlns:w16="http://schemas.microsoft.com/office/word/2018/wordml" xmlns:w16du="http://schemas.microsoft.com/office/word/2023/wordml/word16du" xmlns:w16sdtdh="http://schemas.microsoft.com/office/word/2020/wordml/sdtdatahash" xmlns:w16sdtfl="http://schemas.microsoft.com/office/word/2024/wordml/sdtformatlock" xmlns:w16se="http://schemas.microsoft.com/office/word/2015/wordml/symex" xmlns:wpg="http://schemas.microsoft.com/office/word/2010/wordprocessingGroup" xmlns:wpi="http://schemas.microsoft.com/office/word/2010/wordprocessingInk" xmlns:wne="http://schemas.microsoft.com/office/word/2006/wordml" xmlns:wps="http://schemas.microsoft.com/office/word/2010/wordprocessingShape" mc:Ignorable="w14 w15 w16se w16cid w16 w16cex w16sdtdh w16sdtfl w16du wp14">
   <w:abstractNum w:abstractNumId="0" w15:restartNumberingAfterBreak="0">
+    <w:nsid w:val="2C0B5965"/>
+    <w:multiLevelType w:val="hybridMultilevel"/>
+    <w:tmpl w:val="AD3EC4F0"/>
+    <w:lvl w:ilvl="0" w:tplc="FFFFFFFF">
+      <w:start w:val="1"/>
+      <w:numFmt w:val="lowerLetter"/>
+      <w:lvlText w:val="%1."/>
+      <w:lvlJc w:val="left"/>
+      <w:pPr>
+        <w:ind w:left="1080" w:hanging="360"/>
+      </w:pPr>
+      <w:rPr>
+        <w:rFonts w:hint="default"/>
+        <w:b/>
+        <w:bCs/>
+      </w:rPr>
+    </w:lvl>
+    <w:lvl w:ilvl="1" w:tplc="FFFFFFFF" w:tentative="1">
+      <w:start w:val="1"/>
+      <w:numFmt w:val="lowerLetter"/>
+      <w:lvlText w:val="%2."/>
+      <w:lvlJc w:val="left"/>
+      <w:pPr>
+        <w:ind w:left="1800" w:hanging="360"/>
+      </w:pPr>
+    </w:lvl>
+    <w:lvl w:ilvl="2" w:tplc="FFFFFFFF" w:tentative="1">
+      <w:start w:val="1"/>
+      <w:numFmt w:val="lowerRoman"/>
+      <w:lvlText w:val="%3."/>
+      <w:lvlJc w:val="right"/>
+      <w:pPr>
+        <w:ind w:left="2520" w:hanging="180"/>
+      </w:pPr>
+    </w:lvl>
+    <w:lvl w:ilvl="3" w:tplc="FFFFFFFF" w:tentative="1">
+      <w:start w:val="1"/>
+      <w:numFmt w:val="decimal"/>
+      <w:lvlText w:val="%4."/>
+      <w:lvlJc w:val="left"/>
+      <w:pPr>
+        <w:ind w:left="3240" w:hanging="360"/>
+      </w:pPr>
+    </w:lvl>
+    <w:lvl w:ilvl="4" w:tplc="FFFFFFFF" w:tentative="1">
+      <w:start w:val="1"/>
+      <w:numFmt w:val="lowerLetter"/>
+      <w:lvlText w:val="%5."/>
+      <w:lvlJc w:val="left"/>
+      <w:pPr>
+        <w:ind w:left="3960" w:hanging="360"/>
+      </w:pPr>
+    </w:lvl>
+    <w:lvl w:ilvl="5" w:tplc="FFFFFFFF" w:tentative="1">
+      <w:start w:val="1"/>
+      <w:numFmt w:val="lowerRoman"/>
+      <w:lvlText w:val="%6."/>
+      <w:lvlJc w:val="right"/>
+      <w:pPr>
+        <w:ind w:left="4680" w:hanging="180"/>
+      </w:pPr>
+    </w:lvl>
+    <w:lvl w:ilvl="6" w:tplc="FFFFFFFF" w:tentative="1">
+      <w:start w:val="1"/>
+      <w:numFmt w:val="decimal"/>
+      <w:lvlText w:val="%7."/>
+      <w:lvlJc w:val="left"/>
+      <w:pPr>
+        <w:ind w:left="5400" w:hanging="360"/>
+      </w:pPr>
+    </w:lvl>
+    <w:lvl w:ilvl="7" w:tplc="FFFFFFFF" w:tentative="1">
+      <w:start w:val="1"/>
+      <w:numFmt w:val="lowerLetter"/>
+      <w:lvlText w:val="%8."/>
+      <w:lvlJc w:val="left"/>
+      <w:pPr>
+        <w:ind w:left="6120" w:hanging="360"/>
+      </w:pPr>
+    </w:lvl>
+    <w:lvl w:ilvl="8" w:tplc="FFFFFFFF" w:tentative="1">
+      <w:start w:val="1"/>
+      <w:numFmt w:val="lowerRoman"/>
+      <w:lvlText w:val="%9."/>
+      <w:lvlJc w:val="right"/>
+      <w:pPr>
+        <w:ind w:left="6840" w:hanging="180"/>
+      </w:pPr>
+    </w:lvl>
+  </w:abstractNum>
+  <w:abstractNum w:abstractNumId="1" w15:restartNumberingAfterBreak="0">
     <w:nsid w:val="3F306250"/>
     <w:multiLevelType w:val="hybridMultilevel"/>
     <w:tmpl w:val="E696C644"/>
@@ -233,11 +1500,11 @@
       </w:pPr>
     </w:lvl>
   </w:abstractNum>
-  <w:abstractNum w:abstractNumId="1" w15:restartNumberingAfterBreak="0">
+  <w:abstractNum w:abstractNumId="2" w15:restartNumberingAfterBreak="0">
     <w:nsid w:val="49E0544D"/>
     <w:multiLevelType w:val="hybridMultilevel"/>
-    <w:tmpl w:val="06183848"/>
-    <w:lvl w:ilvl="0" w:tplc="55BC7F9C">
+    <w:tmpl w:val="AD3EC4F0"/>
+    <w:lvl w:ilvl="0" w:tplc="C73262E4">
       <w:start w:val="1"/>
       <w:numFmt w:val="lowerLetter"/>
       <w:lvlText w:val="%1."/>
@@ -247,6 +1514,8 @@
       </w:pPr>
       <w:rPr>
         <w:rFonts w:hint="default"/>
+        <w:b/>
+        <w:bCs/>
       </w:rPr>
     </w:lvl>
     <w:lvl w:ilvl="1" w:tplc="0C090019" w:tentative="1">
@@ -322,7 +1591,7 @@
       </w:pPr>
     </w:lvl>
   </w:abstractNum>
-  <w:abstractNum w:abstractNumId="2" w15:restartNumberingAfterBreak="0">
+  <w:abstractNum w:abstractNumId="3" w15:restartNumberingAfterBreak="0">
     <w:nsid w:val="5D927A9E"/>
     <w:multiLevelType w:val="hybridMultilevel"/>
     <w:tmpl w:val="1C7E9744"/>
@@ -412,13 +1681,16 @@
     </w:lvl>
   </w:abstractNum>
   <w:num w:numId="1" w16cid:durableId="1788963683">
-    <w:abstractNumId w:val="0"/>
+    <w:abstractNumId w:val="1"/>
   </w:num>
   <w:num w:numId="2" w16cid:durableId="2118016486">
+    <w:abstractNumId w:val="3"/>
+  </w:num>
+  <w:num w:numId="3" w16cid:durableId="1544636828">
     <w:abstractNumId w:val="2"/>
   </w:num>
-  <w:num w:numId="3" w16cid:durableId="1544636828">
-    <w:abstractNumId w:val="1"/>
+  <w:num w:numId="4" w16cid:durableId="1297881350">
+    <w:abstractNumId w:val="0"/>
   </w:num>
 </w:numbering>
 </file>
@@ -1025,7 +2297,6 @@
   <w:style w:type="character" w:default="1" w:styleId="DefaultParagraphFont">
     <w:name w:val="Default Paragraph Font"/>
     <w:uiPriority w:val="1"/>
-    <w:semiHidden/>
     <w:unhideWhenUsed/>
   </w:style>
   <w:style w:type="table" w:default="1" w:styleId="TableNormal">
@@ -1354,6 +2625,17 @@
       <w:sz w:val="24"/>
       <w:szCs w:val="24"/>
       <w:lang w:eastAsia="en-AU"/>
+    </w:rPr>
+  </w:style>
+  <w:style w:type="character" w:styleId="Emphasis">
+    <w:name w:val="Emphasis"/>
+    <w:basedOn w:val="DefaultParagraphFont"/>
+    <w:uiPriority w:val="20"/>
+    <w:qFormat/>
+    <w:rsid w:val="006A370B"/>
+    <w:rPr>
+      <w:i/>
+      <w:iCs/>
     </w:rPr>
   </w:style>
 </w:styles>

</xml_diff>

<commit_message>
g4 lit survey all added
</commit_message>
<xml_diff>
--- a/papers/literature_survey.docx
+++ b/papers/literature_survey.docx
@@ -147,112 +147,7 @@
           <w:b/>
           <w:bCs/>
         </w:rPr>
-        <w:t>Show</w:t>
-      </w:r>
-      <w:r>
-        <w:rPr>
-          <w:b/>
-          <w:bCs/>
-        </w:rPr>
-        <w:t xml:space="preserve"> </w:t>
-      </w:r>
-      <w:r>
-        <w:rPr>
-          <w:b/>
-          <w:bCs/>
-        </w:rPr>
-        <w:t>and</w:t>
-      </w:r>
-      <w:r>
-        <w:rPr>
-          <w:b/>
-          <w:bCs/>
-        </w:rPr>
-        <w:t xml:space="preserve"> </w:t>
-      </w:r>
-      <w:r>
-        <w:rPr>
-          <w:b/>
-          <w:bCs/>
-        </w:rPr>
-        <w:t>Tell:</w:t>
-      </w:r>
-      <w:r>
-        <w:rPr>
-          <w:b/>
-          <w:bCs/>
-        </w:rPr>
-        <w:t xml:space="preserve"> </w:t>
-      </w:r>
-      <w:r>
-        <w:rPr>
-          <w:b/>
-          <w:bCs/>
-        </w:rPr>
-        <w:t>A</w:t>
-      </w:r>
-      <w:r>
-        <w:rPr>
-          <w:b/>
-          <w:bCs/>
-        </w:rPr>
-        <w:t xml:space="preserve"> </w:t>
-      </w:r>
-      <w:r>
-        <w:rPr>
-          <w:b/>
-          <w:bCs/>
-        </w:rPr>
-        <w:t>Neural</w:t>
-      </w:r>
-      <w:r>
-        <w:rPr>
-          <w:b/>
-          <w:bCs/>
-        </w:rPr>
-        <w:t xml:space="preserve"> </w:t>
-      </w:r>
-      <w:r>
-        <w:rPr>
-          <w:b/>
-          <w:bCs/>
-        </w:rPr>
-        <w:t>Image</w:t>
-      </w:r>
-      <w:r>
-        <w:rPr>
-          <w:b/>
-          <w:bCs/>
-        </w:rPr>
-        <w:t xml:space="preserve"> </w:t>
-      </w:r>
-      <w:r>
-        <w:rPr>
-          <w:b/>
-          <w:bCs/>
-        </w:rPr>
-        <w:t>Caption</w:t>
-      </w:r>
-      <w:r>
-        <w:rPr>
-          <w:b/>
-          <w:bCs/>
-        </w:rPr>
-        <w:t xml:space="preserve"> </w:t>
-      </w:r>
-      <w:r>
-        <w:rPr>
-          <w:b/>
-          <w:bCs/>
-        </w:rPr>
-        <w:t>Generator</w:t>
-      </w:r>
-      <w:r>
-        <w:rPr>
-          <w:b/>
-          <w:bCs/>
-        </w:rPr>
-        <w:t xml:space="preserve">” </w:t>
+        <w:t xml:space="preserve">Show and Tell: A Neural Image Caption Generator” </w:t>
       </w:r>
     </w:p>
     <w:p>
@@ -381,15 +276,7 @@
           <w:bCs/>
           <w:lang w:eastAsia="en-AU"/>
         </w:rPr>
-        <w:t>Reinforced Cross-modal Alignment for Radiology Report Generation</w:t>
-      </w:r>
-      <w:r>
-        <w:rPr>
-          <w:b/>
-          <w:bCs/>
-          <w:lang w:eastAsia="en-AU"/>
-        </w:rPr>
-        <w:t>”</w:t>
+        <w:t>Reinforced Cross-modal Alignment for Radiology Report Generation”</w:t>
       </w:r>
     </w:p>
     <w:p>
@@ -499,15 +386,7 @@
           <w:bCs/>
           <w:lang w:eastAsia="en-AU"/>
         </w:rPr>
-        <w:t>Generating Radiology Reports via Memory-driven Transformer</w:t>
-      </w:r>
-      <w:r>
-        <w:rPr>
-          <w:b/>
-          <w:bCs/>
-          <w:lang w:eastAsia="en-AU"/>
-        </w:rPr>
-        <w:t>”</w:t>
+        <w:t>Generating Radiology Reports via Memory-driven Transformer”</w:t>
       </w:r>
     </w:p>
     <w:p>
@@ -607,15 +486,7 @@
           <w:bCs/>
           <w:lang w:eastAsia="en-AU"/>
         </w:rPr>
-        <w:t>On the Automatic Generation of Medical Imaging Reports</w:t>
-      </w:r>
-      <w:r>
-        <w:rPr>
-          <w:b/>
-          <w:bCs/>
-          <w:lang w:eastAsia="en-AU"/>
-        </w:rPr>
-        <w:t>”</w:t>
+        <w:t>On the Automatic Generation of Medical Imaging Reports”</w:t>
       </w:r>
     </w:p>
     <w:p>
@@ -736,15 +607,7 @@
           <w:bCs/>
           <w:lang w:eastAsia="en-AU"/>
         </w:rPr>
-        <w:t>Focal Loss for Dense Object Detection</w:t>
-      </w:r>
-      <w:r>
-        <w:rPr>
-          <w:b/>
-          <w:bCs/>
-          <w:lang w:eastAsia="en-AU"/>
-        </w:rPr>
-        <w:t>”</w:t>
+        <w:t>Focal Loss for Dense Object Detection”</w:t>
       </w:r>
     </w:p>
     <w:p>
@@ -963,15 +826,7 @@
           <w:bCs/>
           <w:lang w:eastAsia="en-AU"/>
         </w:rPr>
-        <w:t>: Radiologist-Level Pneumonia Detection on Chest X-Rays with Deep Learning</w:t>
-      </w:r>
-      <w:r>
-        <w:rPr>
-          <w:b/>
-          <w:bCs/>
-          <w:lang w:eastAsia="en-AU"/>
-        </w:rPr>
-        <w:t>”</w:t>
+        <w:t>: Radiologist-Level Pneumonia Detection on Chest X-Rays with Deep Learning”</w:t>
       </w:r>
     </w:p>
     <w:p>
@@ -1120,28 +975,7 @@
           <w:b/>
           <w:bCs/>
         </w:rPr>
-        <w:t>GIT-CXR: End-to-End Transformer for Chest X-Ray</w:t>
-      </w:r>
-      <w:r>
-        <w:rPr>
-          <w:b/>
-          <w:bCs/>
-        </w:rPr>
-        <w:t xml:space="preserve"> </w:t>
-      </w:r>
-      <w:r>
-        <w:rPr>
-          <w:b/>
-          <w:bCs/>
-        </w:rPr>
-        <w:t>Report Generation</w:t>
-      </w:r>
-      <w:r>
-        <w:rPr>
-          <w:b/>
-          <w:bCs/>
-        </w:rPr>
-        <w:t>”</w:t>
+        <w:t>GIT-CXR: End-to-End Transformer for Chest X-Ray Report Generation”</w:t>
       </w:r>
     </w:p>
     <w:p>
@@ -1193,15 +1027,7 @@
           <w:bCs/>
           <w:lang w:eastAsia="en-AU"/>
         </w:rPr>
-        <w:t>Radiology Report Generation via Multi-objective Preference Optimization</w:t>
-      </w:r>
-      <w:r>
-        <w:rPr>
-          <w:b/>
-          <w:bCs/>
-          <w:lang w:eastAsia="en-AU"/>
-        </w:rPr>
-        <w:t>”</w:t>
+        <w:t>Radiology Report Generation via Multi-objective Preference Optimization”</w:t>
       </w:r>
     </w:p>
     <w:p>
@@ -1302,8 +1128,335 @@
         <w:pStyle w:val="ListParagraph"/>
         <w:ind w:left="1080"/>
         <w:rPr>
+          <w:lang w:eastAsia="en-AU"/>
+        </w:rPr>
+      </w:pPr>
+      <w:r>
+        <w:rPr>
+          <w:lang w:eastAsia="en-AU"/>
+        </w:rPr>
+        <w:t xml:space="preserve">Li et al. (2019) proposed KERP (Knowledge-driven Encode, Retrieve, Paraphrase), a hybrid retrieval-generation framework for medical image report generation that combines prior medical knowledge with deep learning. Unlike traditional encoder-decoder models, KERP decomposes report generation into three stages: encoding visual features into an abnormality graph, retrieving template sentences based on detected abnormalities, and paraphrasing templates into final reports. The framework introduced a Graph Transformer (GTR) module to model relationships between images, abnormality graphs, and text sequences using attention mechanisms. Evaluated on the IU X-Ray and CX-CHR datasets, KERP achieved state-of-the-art performance with BLEU-4 scores of 0.162 on IU X-Ray and 0.473 on CX-CHR, while also improving ROUGE-L and human evaluation scores compared to earlier methods such as </w:t>
+      </w:r>
+      <w:proofErr w:type="spellStart"/>
+      <w:r>
+        <w:rPr>
+          <w:lang w:eastAsia="en-AU"/>
+        </w:rPr>
+        <w:t>CoAtt</w:t>
+      </w:r>
+      <w:proofErr w:type="spellEnd"/>
+      <w:r>
+        <w:rPr>
+          <w:lang w:eastAsia="en-AU"/>
+        </w:rPr>
+        <w:t xml:space="preserve"> and HRGR-Agent. The paper demonstrated that incorporating explicit medical knowledge and graph-based reasoning improves both report quality and interpretability through abnormality graphs and visual attention maps.</w:t>
+      </w:r>
+    </w:p>
+    <w:p>
+      <w:pPr>
+        <w:pStyle w:val="ListParagraph"/>
+        <w:ind w:left="1080"/>
+        <w:rPr>
+          <w:lang w:eastAsia="en-AU"/>
+        </w:rPr>
+      </w:pPr>
+    </w:p>
+    <w:p>
+      <w:pPr>
+        <w:pStyle w:val="ListParagraph"/>
+        <w:numPr>
+          <w:ilvl w:val="0"/>
+          <w:numId w:val="3"/>
+        </w:numPr>
+        <w:rPr>
+          <w:lang w:eastAsia="en-AU"/>
+        </w:rPr>
+      </w:pPr>
+      <w:r>
+        <w:rPr>
           <w:b/>
           <w:bCs/>
+          <w:lang w:eastAsia="en-AU"/>
+        </w:rPr>
+        <w:t>“</w:t>
+      </w:r>
+      <w:proofErr w:type="spellStart"/>
+      <w:r>
+        <w:rPr>
+          <w:b/>
+          <w:bCs/>
+          <w:lang w:eastAsia="en-AU"/>
+        </w:rPr>
+        <w:t>MedCLIP</w:t>
+      </w:r>
+      <w:proofErr w:type="spellEnd"/>
+      <w:r>
+        <w:rPr>
+          <w:b/>
+          <w:bCs/>
+          <w:lang w:eastAsia="en-AU"/>
+        </w:rPr>
+        <w:t>: Contrastive Learning from Unpaired Medical Images and Text</w:t>
+      </w:r>
+      <w:r>
+        <w:rPr>
+          <w:b/>
+          <w:bCs/>
+          <w:lang w:eastAsia="en-AU"/>
+        </w:rPr>
+        <w:t>”</w:t>
+      </w:r>
+    </w:p>
+    <w:p>
+      <w:pPr>
+        <w:pStyle w:val="ListParagraph"/>
+        <w:ind w:left="1080"/>
+        <w:rPr>
+          <w:lang w:eastAsia="en-AU"/>
+        </w:rPr>
+      </w:pPr>
+      <w:r>
+        <w:rPr>
+          <w:lang w:eastAsia="en-AU"/>
+        </w:rPr>
+        <w:t xml:space="preserve">Wang et al. (2022) proposed </w:t>
+      </w:r>
+      <w:proofErr w:type="spellStart"/>
+      <w:r>
+        <w:rPr>
+          <w:lang w:eastAsia="en-AU"/>
+        </w:rPr>
+        <w:t>MedCLIP</w:t>
+      </w:r>
+      <w:proofErr w:type="spellEnd"/>
+      <w:r>
+        <w:rPr>
+          <w:lang w:eastAsia="en-AU"/>
+        </w:rPr>
+        <w:t xml:space="preserve">, a contrastive vision-language framework designed for medical image-text representation learning using unpaired medical images and reports. Unlike traditional CLIP-based methods that require paired image-text datasets, </w:t>
+      </w:r>
+      <w:proofErr w:type="spellStart"/>
+      <w:r>
+        <w:rPr>
+          <w:lang w:eastAsia="en-AU"/>
+        </w:rPr>
+        <w:t>MedCLIP</w:t>
+      </w:r>
+      <w:proofErr w:type="spellEnd"/>
+      <w:r>
+        <w:rPr>
+          <w:lang w:eastAsia="en-AU"/>
+        </w:rPr>
+        <w:t xml:space="preserve"> decouples images and text during training, allowing the model to leverage large-scale image-only and text-only medical datasets. The framework also introduced a semantic matching loss based on medical knowledge extracted using UMLS concepts and </w:t>
+      </w:r>
+      <w:proofErr w:type="spellStart"/>
+      <w:r>
+        <w:rPr>
+          <w:lang w:eastAsia="en-AU"/>
+        </w:rPr>
+        <w:t>MetaMap</w:t>
+      </w:r>
+      <w:proofErr w:type="spellEnd"/>
+      <w:r>
+        <w:rPr>
+          <w:lang w:eastAsia="en-AU"/>
+        </w:rPr>
+        <w:t xml:space="preserve">, helping reduce false negatives commonly encountered in contrastive learning. The model used a </w:t>
+      </w:r>
+      <w:proofErr w:type="spellStart"/>
+      <w:r>
+        <w:rPr>
+          <w:lang w:eastAsia="en-AU"/>
+        </w:rPr>
+        <w:t>BioClinicalBERT</w:t>
+      </w:r>
+      <w:proofErr w:type="spellEnd"/>
+      <w:r>
+        <w:rPr>
+          <w:lang w:eastAsia="en-AU"/>
+        </w:rPr>
+        <w:t xml:space="preserve"> text encoder together with ResNet50 or Swin Transformer visual </w:t>
+      </w:r>
+      <w:proofErr w:type="gramStart"/>
+      <w:r>
+        <w:rPr>
+          <w:lang w:eastAsia="en-AU"/>
+        </w:rPr>
+        <w:t>encoders, and</w:t>
+      </w:r>
+      <w:proofErr w:type="gramEnd"/>
+      <w:r>
+        <w:rPr>
+          <w:lang w:eastAsia="en-AU"/>
+        </w:rPr>
+        <w:t xml:space="preserve"> was evaluated on multiple chest X-ray datasets including </w:t>
+      </w:r>
+      <w:proofErr w:type="spellStart"/>
+      <w:r>
+        <w:rPr>
+          <w:lang w:eastAsia="en-AU"/>
+        </w:rPr>
+        <w:t>CheXpert</w:t>
+      </w:r>
+      <w:proofErr w:type="spellEnd"/>
+      <w:r>
+        <w:rPr>
+          <w:lang w:eastAsia="en-AU"/>
+        </w:rPr>
+        <w:t xml:space="preserve">, MIMIC-CXR, COVID, and RSNA Pneumonia. </w:t>
+      </w:r>
+    </w:p>
+    <w:p>
+      <w:pPr>
+        <w:pStyle w:val="ListParagraph"/>
+        <w:ind w:left="1080"/>
+        <w:rPr>
+          <w:lang w:eastAsia="en-AU"/>
+        </w:rPr>
+      </w:pPr>
+    </w:p>
+    <w:p>
+      <w:pPr>
+        <w:pStyle w:val="ListParagraph"/>
+        <w:ind w:left="1080"/>
+        <w:rPr>
+          <w:lang w:eastAsia="en-AU"/>
+        </w:rPr>
+      </w:pPr>
+      <w:proofErr w:type="spellStart"/>
+      <w:r>
+        <w:rPr>
+          <w:lang w:eastAsia="en-AU"/>
+        </w:rPr>
+        <w:t>MedCLIP</w:t>
+      </w:r>
+      <w:proofErr w:type="spellEnd"/>
+      <w:r>
+        <w:rPr>
+          <w:lang w:eastAsia="en-AU"/>
+        </w:rPr>
+        <w:t xml:space="preserve"> achieved state-of-the-art performance across zero-shot classification, supervised classification, and image-text retrieval tasks while using significantly </w:t>
+      </w:r>
+      <w:proofErr w:type="gramStart"/>
+      <w:r>
+        <w:rPr>
+          <w:lang w:eastAsia="en-AU"/>
+        </w:rPr>
+        <w:t>less</w:t>
+      </w:r>
+      <w:proofErr w:type="gramEnd"/>
+      <w:r>
+        <w:rPr>
+          <w:lang w:eastAsia="en-AU"/>
+        </w:rPr>
+        <w:t xml:space="preserve"> pretraining data than previous methods such as </w:t>
+      </w:r>
+      <w:proofErr w:type="spellStart"/>
+      <w:r>
+        <w:rPr>
+          <w:lang w:eastAsia="en-AU"/>
+        </w:rPr>
+        <w:t>ConVIRT</w:t>
+      </w:r>
+      <w:proofErr w:type="spellEnd"/>
+      <w:r>
+        <w:rPr>
+          <w:lang w:eastAsia="en-AU"/>
+        </w:rPr>
+        <w:t xml:space="preserve"> and </w:t>
+      </w:r>
+      <w:proofErr w:type="spellStart"/>
+      <w:r>
+        <w:rPr>
+          <w:lang w:eastAsia="en-AU"/>
+        </w:rPr>
+        <w:t>GLoRIA</w:t>
+      </w:r>
+      <w:proofErr w:type="spellEnd"/>
+      <w:r>
+        <w:rPr>
+          <w:lang w:eastAsia="en-AU"/>
+        </w:rPr>
+        <w:t xml:space="preserve">. On the CheXpert-5x200 dataset, </w:t>
+      </w:r>
+      <w:proofErr w:type="spellStart"/>
+      <w:r>
+        <w:rPr>
+          <w:lang w:eastAsia="en-AU"/>
+        </w:rPr>
+        <w:t>MedCLIP-ViT</w:t>
+      </w:r>
+      <w:proofErr w:type="spellEnd"/>
+      <w:r>
+        <w:rPr>
+          <w:lang w:eastAsia="en-AU"/>
+        </w:rPr>
+        <w:t xml:space="preserve"> achieved a zero-shot accuracy of 59.4%, outperforming </w:t>
+      </w:r>
+      <w:proofErr w:type="spellStart"/>
+      <w:r>
+        <w:rPr>
+          <w:lang w:eastAsia="en-AU"/>
+        </w:rPr>
+        <w:t>GLoRIA</w:t>
+      </w:r>
+      <w:proofErr w:type="spellEnd"/>
+      <w:r>
+        <w:rPr>
+          <w:lang w:eastAsia="en-AU"/>
+        </w:rPr>
+        <w:t xml:space="preserve"> (43.2%) and </w:t>
+      </w:r>
+      <w:proofErr w:type="spellStart"/>
+      <w:r>
+        <w:rPr>
+          <w:lang w:eastAsia="en-AU"/>
+        </w:rPr>
+        <w:t>ConVIRT</w:t>
+      </w:r>
+      <w:proofErr w:type="spellEnd"/>
+      <w:r>
+        <w:rPr>
+          <w:lang w:eastAsia="en-AU"/>
+        </w:rPr>
+        <w:t xml:space="preserve"> (41.9%). The model also demonstrated strong transferability, achieving 84.7% zero-shot accuracy on the COVID dataset despite never being trained on COVID-19 images. Furthermore, </w:t>
+      </w:r>
+      <w:proofErr w:type="spellStart"/>
+      <w:r>
+        <w:rPr>
+          <w:lang w:eastAsia="en-AU"/>
+        </w:rPr>
+        <w:t>MedCLIP</w:t>
+      </w:r>
+      <w:proofErr w:type="spellEnd"/>
+      <w:r>
+        <w:rPr>
+          <w:lang w:eastAsia="en-AU"/>
+        </w:rPr>
+        <w:t xml:space="preserve"> produced more clinically meaningful latent representations through improved clustering in t-SNE visualisations and achieved superior image-text retrieval precision compared to baseline methods.</w:t>
+      </w:r>
+    </w:p>
+    <w:p>
+      <w:pPr>
+        <w:pStyle w:val="ListParagraph"/>
+        <w:ind w:left="1080"/>
+        <w:rPr>
+          <w:lang w:eastAsia="en-AU"/>
+        </w:rPr>
+      </w:pPr>
+    </w:p>
+    <w:p>
+      <w:pPr>
+        <w:pStyle w:val="ListParagraph"/>
+        <w:ind w:left="1080"/>
+        <w:rPr>
+          <w:lang w:eastAsia="en-AU"/>
+        </w:rPr>
+      </w:pPr>
+    </w:p>
+    <w:p>
+      <w:pPr>
+        <w:rPr>
           <w:lang w:eastAsia="en-AU"/>
         </w:rPr>
       </w:pPr>

</xml_diff>

<commit_message>
lit review 11 papers completed
</commit_message>
<xml_diff>
--- a/papers/literature_survey.docx
+++ b/papers/literature_survey.docx
@@ -1444,6 +1444,146 @@
           <w:lang w:eastAsia="en-AU"/>
         </w:rPr>
       </w:pPr>
+    </w:p>
+    <w:p>
+      <w:pPr>
+        <w:pStyle w:val="ListParagraph"/>
+        <w:ind w:left="1080"/>
+        <w:rPr>
+          <w:lang w:eastAsia="en-AU"/>
+        </w:rPr>
+      </w:pPr>
+    </w:p>
+    <w:p>
+      <w:pPr>
+        <w:pStyle w:val="ListParagraph"/>
+        <w:ind w:left="1080"/>
+        <w:rPr>
+          <w:lang w:eastAsia="en-AU"/>
+        </w:rPr>
+      </w:pPr>
+    </w:p>
+    <w:p>
+      <w:pPr>
+        <w:pStyle w:val="ListParagraph"/>
+        <w:numPr>
+          <w:ilvl w:val="0"/>
+          <w:numId w:val="3"/>
+        </w:numPr>
+        <w:rPr>
+          <w:b/>
+          <w:bCs/>
+          <w:lang w:eastAsia="en-AU"/>
+        </w:rPr>
+      </w:pPr>
+      <w:r>
+        <w:rPr>
+          <w:b/>
+          <w:bCs/>
+          <w:lang w:eastAsia="en-AU"/>
+        </w:rPr>
+        <w:lastRenderedPageBreak/>
+        <w:t>“</w:t>
+      </w:r>
+      <w:r>
+        <w:rPr>
+          <w:b/>
+          <w:bCs/>
+          <w:lang w:eastAsia="en-AU"/>
+        </w:rPr>
+        <w:t>Recent Progress in Deep Learning for Chest X-Ray</w:t>
+      </w:r>
+      <w:r>
+        <w:rPr>
+          <w:b/>
+          <w:bCs/>
+          <w:lang w:eastAsia="en-AU"/>
+        </w:rPr>
+        <w:t xml:space="preserve"> </w:t>
+      </w:r>
+      <w:r>
+        <w:rPr>
+          <w:b/>
+          <w:bCs/>
+          <w:lang w:eastAsia="en-AU"/>
+        </w:rPr>
+        <w:t>Report Generation</w:t>
+      </w:r>
+      <w:r>
+        <w:rPr>
+          <w:b/>
+          <w:bCs/>
+          <w:lang w:eastAsia="en-AU"/>
+        </w:rPr>
+        <w:t>”</w:t>
+      </w:r>
+    </w:p>
+    <w:p>
+      <w:pPr>
+        <w:pStyle w:val="ListParagraph"/>
+        <w:spacing w:before="100" w:beforeAutospacing="1" w:after="100" w:afterAutospacing="1" w:line="240" w:lineRule="auto"/>
+        <w:ind w:left="1080"/>
+        <w:rPr>
+          <w:rFonts w:ascii="Times New Roman" w:eastAsia="Times New Roman" w:hAnsi="Times New Roman" w:cs="Times New Roman"/>
+          <w:kern w:val="0"/>
+          <w:sz w:val="24"/>
+          <w:szCs w:val="24"/>
+          <w:lang w:eastAsia="en-AU"/>
+          <w14:ligatures w14:val="none"/>
+        </w:rPr>
+      </w:pPr>
+      <w:r>
+        <w:rPr>
+          <w:rFonts w:ascii="Times New Roman" w:eastAsia="Times New Roman" w:hAnsi="Times New Roman" w:cs="Times New Roman"/>
+          <w:kern w:val="0"/>
+          <w:sz w:val="24"/>
+          <w:szCs w:val="24"/>
+          <w:lang w:eastAsia="en-AU"/>
+          <w14:ligatures w14:val="none"/>
+        </w:rPr>
+        <w:t xml:space="preserve">Chen et al. (2020) proposed R2Gen, a memory-driven Transformer architecture for automated radiology report generation. Unlike earlier CNN-LSTM approaches, the model used a Transformer decoder together with a relational memory module to better capture long-range dependencies and preserve clinically relevant context throughout report generation. The framework also introduced a memory-driven conditional layer normalization mechanism that injects stored contextual information back into the decoder to guide future token prediction. The authors argued that radiology reports are substantially longer and more complex than standard image captions, making memory-aware decoding important for maintaining semantic consistency and reducing fragmented outputs. </w:t>
+      </w:r>
+    </w:p>
+    <w:p>
+      <w:pPr>
+        <w:pStyle w:val="ListParagraph"/>
+        <w:spacing w:before="100" w:beforeAutospacing="1" w:after="100" w:afterAutospacing="1" w:line="240" w:lineRule="auto"/>
+        <w:ind w:left="1080"/>
+        <w:rPr>
+          <w:rFonts w:ascii="Times New Roman" w:eastAsia="Times New Roman" w:hAnsi="Times New Roman" w:cs="Times New Roman"/>
+          <w:kern w:val="0"/>
+          <w:sz w:val="24"/>
+          <w:szCs w:val="24"/>
+          <w:lang w:eastAsia="en-AU"/>
+          <w14:ligatures w14:val="none"/>
+        </w:rPr>
+      </w:pPr>
+    </w:p>
+    <w:p>
+      <w:pPr>
+        <w:pStyle w:val="ListParagraph"/>
+        <w:spacing w:before="100" w:beforeAutospacing="1" w:after="100" w:afterAutospacing="1" w:line="240" w:lineRule="auto"/>
+        <w:ind w:left="1080"/>
+        <w:rPr>
+          <w:rFonts w:ascii="Times New Roman" w:eastAsia="Times New Roman" w:hAnsi="Times New Roman" w:cs="Times New Roman"/>
+          <w:kern w:val="0"/>
+          <w:sz w:val="24"/>
+          <w:szCs w:val="24"/>
+          <w:lang w:eastAsia="en-AU"/>
+          <w14:ligatures w14:val="none"/>
+        </w:rPr>
+      </w:pPr>
+      <w:r>
+        <w:rPr>
+          <w:rFonts w:ascii="Times New Roman" w:eastAsia="Times New Roman" w:hAnsi="Times New Roman" w:cs="Times New Roman"/>
+          <w:kern w:val="0"/>
+          <w:sz w:val="24"/>
+          <w:szCs w:val="24"/>
+          <w:lang w:eastAsia="en-AU"/>
+          <w14:ligatures w14:val="none"/>
+        </w:rPr>
+        <w:t>The model achieved state-of-the-art performance on both IU X-Ray and MIMIC-CXR datasets. On IU X-Ray, R2Gen achieved a BLEU-4 score of approximately 0.167, METEOR of 0.187, and ROUGE-L of 0.362, outperforming several earlier encoder-decoder baselines. The paper also demonstrated improved image-text attention alignment and stronger generation of clinically meaningful medical terminology compared to previous methods. However, despite these improvements, the framework still relied heavily on lexical overlap metrics such as BLEU and ROUGE, which do not fully measure semantic correctness or interpretability. This limitation motivates more recent work focusing on semantic evaluation and latent-space analysis in radiology report generation.</w:t>
+      </w:r>
     </w:p>
     <w:p>
       <w:pPr>

</xml_diff>